<commit_message>
Record Ryan PB-16 review and PB-31 owner confirmation
</commit_message>
<xml_diff>
--- a/submissions/BPMEA/BPMEA_Written_Evaluation.docx
+++ b/submissions/BPMEA/BPMEA_Written_Evaluation.docx
@@ -318,23 +318,16 @@
               <w:pStyle w:val="Compact"/>
             </w:pPr>
             <w:r>
-              <w:t xml:space="preserve">Part 1 complete; Part 2 written 19 October,</w:t>
-            </w:r>
-            <w:r>
-              <w:t xml:space="preserve"> </w:t>
-            </w:r>
-            <w:r>
-              <w:rPr>
-                <w:rStyle w:val="VerbatimChar"/>
-              </w:rPr>
-              <w:t xml:space="preserve">PB-31</w:t>
-            </w:r>
-            <w:r>
-              <w:t xml:space="preserve"> </w:t>
-            </w:r>
-            <w:r>
-              <w:t xml:space="preserve">sign-off not recorded</w:t>
-            </w:r>
+              <w:t>Part 1 complete; Part 2 owner confirmation recorded 20 October 2026; Ruby second-owner review pending</w:t>
+            </w:r>
+            <w:r/>
+            <w:r>
+              <w:rPr>
+                <w:rStyle w:val="VerbatimChar"/>
+              </w:rPr>
+            </w:r>
+            <w:r/>
+            <w:r/>
           </w:p>
         </w:tc>
       </w:tr>
@@ -5377,14 +5370,13 @@
           <w:b/>
           <w:bCs/>
         </w:rPr>
-        <w:t xml:space="preserve">Status: written 19 October;</w:t>
+        <w:t>Status: written 19 October; owner confirmation recorded 20 October 2026. Ruby second-owner review remains pending. The evaluation reports the archived verdicts and claims no new test execution.</w:t>
       </w:r>
       <w:r>
         <w:rPr>
           <w:b/>
           <w:bCs/>
         </w:rPr>
-        <w:t xml:space="preserve"> </w:t>
       </w:r>
       <w:r>
         <w:rPr>
@@ -5392,39 +5384,78 @@
           <w:b/>
           <w:bCs/>
         </w:rPr>
-        <w:t xml:space="preserve">PB-31</w:t>
       </w:r>
       <w:r>
         <w:rPr>
           <w:b/>
           <w:bCs/>
         </w:rPr>
-        <w:t xml:space="preserve"> </w:t>
       </w:r>
       <w:r>
         <w:rPr>
           <w:b/>
           <w:bCs/>
         </w:rPr>
-        <w:t xml:space="preserve">sign-off not recorded.</w:t>
-      </w:r>
-      <w:r>
-        <w:t xml:space="preserve"> </w:t>
-      </w:r>
-      <w:r>
-        <w:t xml:space="preserve">Part 2 belongs to</w:t>
-      </w:r>
-      <w:r>
-        <w:t xml:space="preserve"> </w:t>
-      </w:r>
-      <w:r>
-        <w:rPr>
-          <w:rStyle w:val="VerbatimChar"/>
-        </w:rPr>
-        <w:t xml:space="preserve">PB-31</w:t>
-      </w:r>
-      <w:r>
-        <w:t xml:space="preserve">. The text below reports the verdicts recorded in the evidence files and adds no run of its own.</w:t>
+      </w:r>
+      <w:r/>
+      <w:r/>
+      <w:r/>
+      <w:r>
+        <w:rPr>
+          <w:rStyle w:val="VerbatimChar"/>
+        </w:rPr>
+      </w:r>
+      <w:r/>
+    </w:p>
+    <w:p>
+      <w:pPr>
+        <w:keepNext/>
+      </w:pPr>
+      <w:r>
+        <w:rPr>
+          <w:b/>
+        </w:rPr>
+        <w:t>PB-31 owner confirmation</w:t>
+      </w:r>
+    </w:p>
+    <w:p>
+      <w:pPr>
+        <w:keepNext/>
+      </w:pPr>
+      <w:r>
+        <w:t>Owner: Guanyan He (Ryan) | Date: 20 October 2026 | Reviewed version: b4e0d23.</w:t>
+      </w:r>
+    </w:p>
+    <w:p>
+      <w:pPr>
+        <w:keepNext w:val="0"/>
+      </w:pPr>
+      <w:r>
+        <w:t>Owner confirmation entered at Ryan's explicit request after review of the archived V3 evidence dated 19 October 2026. This records an evidence review, not a personally executed rerun.</w:t>
+      </w:r>
+    </w:p>
+    <w:p>
+      <w:pPr>
+        <w:keepNext w:val="0"/>
+      </w:pPr>
+      <w:r>
+        <w:t>The records show G07 and AT-01, AT-02, AT-04, AT-05 and AT-06 passed. AT-03 failed because role-based access control is not implemented. Untested branches and browser-side validation remain identified as limitations.</w:t>
+      </w:r>
+    </w:p>
+    <w:p>
+      <w:pPr>
+        <w:keepNext w:val="0"/>
+      </w:pPr>
+      <w:r>
+        <w:t>Decision: Part 2 accurately reports the archived results and limitations. This is not approval of all business requirements or all process branches.</w:t>
+      </w:r>
+    </w:p>
+    <w:p>
+      <w:pPr>
+        <w:keepNext w:val="0"/>
+      </w:pPr>
+      <w:r>
+        <w:t>Typed name: Guanyan He (Ryan). Second-owner review: Ruby - pending.</w:t>
       </w:r>
     </w:p>
     <w:p>
@@ -5530,6 +5561,7 @@
           <w:p>
             <w:pPr>
               <w:pStyle w:val="Compact"/>
+              <w:keepNext/>
             </w:pPr>
             <w:r>
               <w:t xml:space="preserve">ID</w:t>
@@ -5543,6 +5575,7 @@
           <w:p>
             <w:pPr>
               <w:pStyle w:val="Compact"/>
+              <w:keepNext/>
             </w:pPr>
             <w:r>
               <w:t xml:space="preserve">What the case asks</w:t>
@@ -5556,6 +5589,7 @@
           <w:p>
             <w:pPr>
               <w:pStyle w:val="Compact"/>
+              <w:keepNext/>
             </w:pPr>
             <w:r>
               <w:t xml:space="preserve">Pass rule</w:t>

</xml_diff>

<commit_message>
Record the second-owner reviews and close the signing gaps
Every B item that owes a review now carries one. Ruby reviewed Part 2 of the
written evaluation (PB-31) and the twelve forms (PB-13); Ender reviewed the V3
operational model (PB-30); Ender, Ryan and Estrella reviewed the worker module,
recorded per file in the new B-6 note, which also states that four files carry
no recorded author. Line 53 of the definition of done is ticked against that
record and nothing else in the file is.

Ryan's PB-16 review keeps its own conclusion verbatim: the corrections he asked
for are recorded in section 11 and were not applied. The group decided on
20 October, with all four members present, to deliver the figures as they
stand, and section 12 says so plainly rather than presenting the defects as
absent.

Status cells in the backlog, the evaluation's status row and the index's limits
list follow the same wording, so the pack no longer reads as work in progress.
</commit_message>
<xml_diff>
--- a/submissions/BPMEA/BPMEA_Written_Evaluation.docx
+++ b/submissions/BPMEA/BPMEA_Written_Evaluation.docx
@@ -318,7 +318,7 @@
               <w:pStyle w:val="Compact"/>
             </w:pPr>
             <w:r>
-              <w:t>Part 1 complete; Part 2 owner confirmation recorded 20 October 2026; Ruby second-owner review pending</w:t>
+              <w:t>Part 1 complete; Part 2 owner confirmation recorded 20 October 2026; second-owner review by Ruby (Hao Zheng) recorded 20 October 2026</w:t>
             </w:r>
             <w:r/>
             <w:r>
@@ -5370,7 +5370,7 @@
           <w:b/>
           <w:bCs/>
         </w:rPr>
-        <w:t>Status: written 19 October; owner confirmation recorded 20 October 2026. Ruby second-owner review remains pending. The evaluation reports the archived verdicts and claims no new test execution.</w:t>
+        <w:t>Status: written 19 October; owner confirmation recorded 20 October 2026; second-owner review by Ruby (Hao Zheng) recorded 20 October 2026. The evaluation reports the archived verdicts and claims no new test execution.</w:t>
       </w:r>
       <w:r>
         <w:rPr>
@@ -5455,7 +5455,7 @@
         <w:keepNext w:val="0"/>
       </w:pPr>
       <w:r>
-        <w:t>Typed name: Guanyan He (Ryan). Second-owner review: Ruby - pending.</w:t>
+        <w:t>Typed name: Guanyan He (Ryan). Second-owner review: Ruby (Hao Zheng), 20 October 2026.</w:t>
       </w:r>
     </w:p>
     <w:p>

</xml_diff>